<commit_message>
#22 Add the "wrong paper" citation defect (resolving DOI, wrong source)
A citation whose DOI resolves but points to a different paper than cited -- the
case a DOI-resolution check alone cannot catch.

- New slop defect `wrong_paper`; Citation gains `metadata_match` + `cited_source`;
  new ground-truth `has_mismatched_citations` + meta `n_mismatched_citations`.
- score.py scores it; the naive baseline predicts False (needs resolution +
  metadata compare): demo recall 0.0 on it vs 1.0 on fabricated_citations.
- Corpus regenerated; files/ re-rendered to 15 fixtures x 4 formats.
- Maps to Finding.verdict overstated/unsupported (DATA_MODEL.md).

Stacked on alex/22-fixture-files (#68).

Co-Authored-By: Claude Opus 4.8 <noreply@anthropic.com>
</commit_message>
<xml_diff>
--- a/tests/fixtures/synthetic/files/blog_post__ai_clean.docx
+++ b/tests/fixtures/synthetic/files/blog_post__ai_clean.docx
@@ -7,7 +7,7 @@
         <w:pStyle w:val="Title"/>
       </w:pPr>
       <w:r>
-        <w:t>Screening pathways for hypertension in underserved populations, Explained</w:t>
+        <w:t>Why workforce pathways into the semiconductor manufacturing sector Matters Now</w:t>
       </w:r>
     </w:p>
     <w:p>
@@ -20,7 +20,7 @@
     </w:p>
     <w:p>
       <w:r>
-        <w:t>What we know about screening pathways for hypertension in underserved populations, and what to watch.</w:t>
+        <w:t>What we know about workforce pathways into the semiconductor manufacturing sector, and what to watch.</w:t>
       </w:r>
     </w:p>
     <w:p>
@@ -33,7 +33,7 @@
     </w:p>
     <w:p>
       <w:r>
-        <w:t>Careful framing guards against overstatement. This piece examines screening pathways for hypertension in underserved populations, a question of growing public interest. Practitioners and policymakers alike have a role to play here.</w:t>
+        <w:t>The evidence base is partial, and important gaps remain. The takeaways are meant to inform, not to prescribe. Careful framing guards against overstatement.</w:t>
       </w:r>
     </w:p>
     <w:p>
@@ -46,7 +46,7 @@
     </w:p>
     <w:p>
       <w:r>
-        <w:t>This piece examines screening pathways for hypertension in underserved populations, a question of growing public interest. Careful framing guards against overstatement. The takeaways are meant to inform, not to prescribe.</w:t>
+        <w:t>The takeaways are meant to inform, not to prescribe. Practitioners and policymakers alike have a role to play here. This piece examines workforce pathways into the semiconductor manufacturing sector, a question of growing public interest.</w:t>
       </w:r>
     </w:p>
     <w:p>
@@ -59,7 +59,7 @@
     </w:p>
     <w:p>
       <w:r>
-        <w:t>Practitioners and policymakers alike have a role to play here.</w:t>
+        <w:t>Recent analysis points toward a tractable path forward.</w:t>
       </w:r>
     </w:p>
     <w:p>
@@ -75,7 +75,7 @@
         <w:pStyle w:val="ListNumber"/>
       </w:pPr>
       <w:r>
-        <w:t>[1] https://doi.org/10.1101/gr.229102</w:t>
+        <w:t>[1] https://doi.org/10.1371/journal.pone.0173664</w:t>
       </w:r>
     </w:p>
     <w:p>
@@ -83,7 +83,7 @@
         <w:pStyle w:val="ListNumber"/>
       </w:pPr>
       <w:r>
-        <w:t>[2] https://doi.org/10.1289/ehp.1104477</w:t>
+        <w:t>[2] https://doi.org/10.1016/j.cell.2016.07.054</w:t>
       </w:r>
     </w:p>
     <w:p>
@@ -91,7 +91,7 @@
         <w:pStyle w:val="ListNumber"/>
       </w:pPr>
       <w:r>
-        <w:t>[3] https://doi.org/10.1038/s41586-020-2649-2</w:t>
+        <w:t>[3] https://doi.org/10.1126/science.1259855</w:t>
       </w:r>
     </w:p>
     <w:p>
@@ -99,7 +99,7 @@
         <w:pStyle w:val="ListNumber"/>
       </w:pPr>
       <w:r>
-        <w:t>[4] https://doi.org/10.1002/anie.201907688</w:t>
+        <w:t>[4] https://doi.org/10.1101/gr.229102</w:t>
       </w:r>
     </w:p>
     <w:p>
@@ -107,7 +107,31 @@
         <w:pStyle w:val="ListNumber"/>
       </w:pPr>
       <w:r>
-        <w:t>[5] https://doi.org/10.1093/nar/gky1055</w:t>
+        <w:t>[5] https://doi.org/10.1056/NEJMoa2034577</w:t>
+      </w:r>
+    </w:p>
+    <w:p>
+      <w:pPr>
+        <w:pStyle w:val="ListNumber"/>
+      </w:pPr>
+      <w:r>
+        <w:t>[6] https://doi.org/10.1038/nature14539</w:t>
+      </w:r>
+    </w:p>
+    <w:p>
+      <w:pPr>
+        <w:pStyle w:val="ListNumber"/>
+      </w:pPr>
+      <w:r>
+        <w:t>[7] https://doi.org/10.1001/jama.2016.9797</w:t>
+      </w:r>
+    </w:p>
+    <w:p>
+      <w:pPr>
+        <w:pStyle w:val="ListNumber"/>
+      </w:pPr>
+      <w:r>
+        <w:t>[8] https://doi.org/10.1371/journal.pone.0173664</w:t>
       </w:r>
     </w:p>
     <w:sectPr>

</xml_diff>

<commit_message>
#22 Add the budget arithmetic-error case (line items don't sum)
Grant budgets are now itemized (personnel/equipment/travel/indirect + a stated
total). New grant-only slop defect budget_math: the stated total does not equal
the sum of the line items -- the last #22 fixture case.

- New ground-truth budget_math column; _extract_budget targets the labeled total.
- score.py scores it with a label-aware deterministic check (robust to the
  sentence-shuffle in laundered docs): demo precision/recall 1.00, like
  fabricated_citations -- in contrast to wrong_paper/near_dup at 0.0.
- render_fixtures adds a budget_math fixture (16 x 4 files); corpus regenerated.

Completes every #22 fixture case. Stacked on alex/22-near-dups (#77).

Co-Authored-By: Claude Opus 4.8 <noreply@anthropic.com>
</commit_message>
<xml_diff>
--- a/tests/fixtures/synthetic/files/blog_post__ai_clean.docx
+++ b/tests/fixtures/synthetic/files/blog_post__ai_clean.docx
@@ -7,7 +7,7 @@
         <w:pStyle w:val="Title"/>
       </w:pPr>
       <w:r>
-        <w:t>Why workforce pathways into the semiconductor manufacturing sector Matters Now</w:t>
+        <w:t>Why behavioral economics of retirement savings among gig workers Matters Now</w:t>
       </w:r>
     </w:p>
     <w:p>
@@ -20,7 +20,7 @@
     </w:p>
     <w:p>
       <w:r>
-        <w:t>What we know about workforce pathways into the semiconductor manufacturing sector, and what to watch.</w:t>
+        <w:t>What we know about behavioral economics of retirement savings among gig workers, and what to watch.</w:t>
       </w:r>
     </w:p>
     <w:p>
@@ -33,7 +33,7 @@
     </w:p>
     <w:p>
       <w:r>
-        <w:t>The evidence base is partial, and important gaps remain. The takeaways are meant to inform, not to prescribe. Careful framing guards against overstatement.</w:t>
+        <w:t>This piece examines behavioral economics of retirement savings among gig workers, a question of growing public interest. Careful framing guards against overstatement. Practitioners and policymakers alike have a role to play here.</w:t>
       </w:r>
     </w:p>
     <w:p>
@@ -46,7 +46,7 @@
     </w:p>
     <w:p>
       <w:r>
-        <w:t>The takeaways are meant to inform, not to prescribe. Practitioners and policymakers alike have a role to play here. This piece examines workforce pathways into the semiconductor manufacturing sector, a question of growing public interest.</w:t>
+        <w:t>The takeaways are meant to inform, not to prescribe. Recent analysis points toward a tractable path forward. The discussion draws on established population methods and current data.</w:t>
       </w:r>
     </w:p>
     <w:p>
@@ -59,7 +59,7 @@
     </w:p>
     <w:p>
       <w:r>
-        <w:t>Recent analysis points toward a tractable path forward.</w:t>
+        <w:t>This piece examines behavioral economics of retirement savings among gig workers, a question of growing public interest.</w:t>
       </w:r>
     </w:p>
     <w:p>
@@ -75,7 +75,7 @@
         <w:pStyle w:val="ListNumber"/>
       </w:pPr>
       <w:r>
-        <w:t>[1] https://doi.org/10.1371/journal.pone.0173664</w:t>
+        <w:t>[1] https://doi.org/10.1021/jacs.9b02765</w:t>
       </w:r>
     </w:p>
     <w:p>
@@ -83,7 +83,7 @@
         <w:pStyle w:val="ListNumber"/>
       </w:pPr>
       <w:r>
-        <w:t>[2] https://doi.org/10.1016/j.cell.2016.07.054</w:t>
+        <w:t>[2] https://doi.org/10.1002/anie.201907688</w:t>
       </w:r>
     </w:p>
     <w:p>
@@ -91,7 +91,7 @@
         <w:pStyle w:val="ListNumber"/>
       </w:pPr>
       <w:r>
-        <w:t>[3] https://doi.org/10.1126/science.1259855</w:t>
+        <w:t>[3] https://doi.org/10.1289/ehp.1104477</w:t>
       </w:r>
     </w:p>
     <w:p>
@@ -99,7 +99,7 @@
         <w:pStyle w:val="ListNumber"/>
       </w:pPr>
       <w:r>
-        <w:t>[4] https://doi.org/10.1101/gr.229102</w:t>
+        <w:t>[4] https://doi.org/10.1056/NEJMoa2034577</w:t>
       </w:r>
     </w:p>
     <w:p>
@@ -107,7 +107,7 @@
         <w:pStyle w:val="ListNumber"/>
       </w:pPr>
       <w:r>
-        <w:t>[5] https://doi.org/10.1056/NEJMoa2034577</w:t>
+        <w:t>[5] https://doi.org/10.1073/pnas.1517384113</w:t>
       </w:r>
     </w:p>
     <w:p>
@@ -115,7 +115,7 @@
         <w:pStyle w:val="ListNumber"/>
       </w:pPr>
       <w:r>
-        <w:t>[6] https://doi.org/10.1038/nature14539</w:t>
+        <w:t>[6] https://doi.org/10.1001/jama.2016.9797</w:t>
       </w:r>
     </w:p>
     <w:p>
@@ -123,7 +123,7 @@
         <w:pStyle w:val="ListNumber"/>
       </w:pPr>
       <w:r>
-        <w:t>[7] https://doi.org/10.1001/jama.2016.9797</w:t>
+        <w:t>[7] https://doi.org/10.1056/NEJMoa2034577</w:t>
       </w:r>
     </w:p>
     <w:p>
@@ -131,7 +131,15 @@
         <w:pStyle w:val="ListNumber"/>
       </w:pPr>
       <w:r>
-        <w:t>[8] https://doi.org/10.1371/journal.pone.0173664</w:t>
+        <w:t>[8] https://doi.org/10.1056/NEJMoa2034577</w:t>
+      </w:r>
+    </w:p>
+    <w:p>
+      <w:pPr>
+        <w:pStyle w:val="ListNumber"/>
+      </w:pPr>
+      <w:r>
+        <w:t>[9] https://doi.org/10.1038/s41586-020-2649-2</w:t>
       </w:r>
     </w:p>
     <w:sectPr>

</xml_diff>

<commit_message>
#22 Complete the fixture corpus on main (near-dup, budget-math, remaining files)
main landed through #73 (wrong_paper + 60 files) but #77/#84/#91 closed without
merging. This carries the missing delta so #22 is complete:

- near-duplicate pairs (--near-dups; is_near_duplicate + duplicate_of)
- budget_math defect (itemized budget whose items don't sum)
- corpus 120 -> 126 records; files 60 -> 72 (adds budget_math + a rendered
  near-duplicate pair)
- score.py scores every defect

Regenerate: python3 scripts/synth/synth_proposals.py --n 120 --offline --seed 42
--near-dups 6 --out tests/fixtures/synthetic

Co-Authored-By: Claude Opus 4.8 <noreply@anthropic.com>
</commit_message>
<xml_diff>
--- a/tests/fixtures/synthetic/files/blog_post__ai_clean.docx
+++ b/tests/fixtures/synthetic/files/blog_post__ai_clean.docx
@@ -7,7 +7,7 @@
         <w:pStyle w:val="Title"/>
       </w:pPr>
       <w:r>
-        <w:t>Why workforce pathways into the semiconductor manufacturing sector Matters Now</w:t>
+        <w:t>Why behavioral economics of retirement savings among gig workers Matters Now</w:t>
       </w:r>
     </w:p>
     <w:p>
@@ -20,7 +20,7 @@
     </w:p>
     <w:p>
       <w:r>
-        <w:t>What we know about workforce pathways into the semiconductor manufacturing sector, and what to watch.</w:t>
+        <w:t>What we know about behavioral economics of retirement savings among gig workers, and what to watch.</w:t>
       </w:r>
     </w:p>
     <w:p>
@@ -33,7 +33,7 @@
     </w:p>
     <w:p>
       <w:r>
-        <w:t>The evidence base is partial, and important gaps remain. The takeaways are meant to inform, not to prescribe. Careful framing guards against overstatement.</w:t>
+        <w:t>This piece examines behavioral economics of retirement savings among gig workers, a question of growing public interest. Careful framing guards against overstatement. Practitioners and policymakers alike have a role to play here.</w:t>
       </w:r>
     </w:p>
     <w:p>
@@ -46,7 +46,7 @@
     </w:p>
     <w:p>
       <w:r>
-        <w:t>The takeaways are meant to inform, not to prescribe. Practitioners and policymakers alike have a role to play here. This piece examines workforce pathways into the semiconductor manufacturing sector, a question of growing public interest.</w:t>
+        <w:t>The takeaways are meant to inform, not to prescribe. Recent analysis points toward a tractable path forward. The discussion draws on established population methods and current data.</w:t>
       </w:r>
     </w:p>
     <w:p>
@@ -59,7 +59,7 @@
     </w:p>
     <w:p>
       <w:r>
-        <w:t>Recent analysis points toward a tractable path forward.</w:t>
+        <w:t>This piece examines behavioral economics of retirement savings among gig workers, a question of growing public interest.</w:t>
       </w:r>
     </w:p>
     <w:p>
@@ -75,7 +75,7 @@
         <w:pStyle w:val="ListNumber"/>
       </w:pPr>
       <w:r>
-        <w:t>[1] https://doi.org/10.1371/journal.pone.0173664</w:t>
+        <w:t>[1] https://doi.org/10.1021/jacs.9b02765</w:t>
       </w:r>
     </w:p>
     <w:p>
@@ -83,7 +83,7 @@
         <w:pStyle w:val="ListNumber"/>
       </w:pPr>
       <w:r>
-        <w:t>[2] https://doi.org/10.1016/j.cell.2016.07.054</w:t>
+        <w:t>[2] https://doi.org/10.1002/anie.201907688</w:t>
       </w:r>
     </w:p>
     <w:p>
@@ -91,7 +91,7 @@
         <w:pStyle w:val="ListNumber"/>
       </w:pPr>
       <w:r>
-        <w:t>[3] https://doi.org/10.1126/science.1259855</w:t>
+        <w:t>[3] https://doi.org/10.1289/ehp.1104477</w:t>
       </w:r>
     </w:p>
     <w:p>
@@ -99,7 +99,7 @@
         <w:pStyle w:val="ListNumber"/>
       </w:pPr>
       <w:r>
-        <w:t>[4] https://doi.org/10.1101/gr.229102</w:t>
+        <w:t>[4] https://doi.org/10.1056/NEJMoa2034577</w:t>
       </w:r>
     </w:p>
     <w:p>
@@ -107,7 +107,7 @@
         <w:pStyle w:val="ListNumber"/>
       </w:pPr>
       <w:r>
-        <w:t>[5] https://doi.org/10.1056/NEJMoa2034577</w:t>
+        <w:t>[5] https://doi.org/10.1073/pnas.1517384113</w:t>
       </w:r>
     </w:p>
     <w:p>
@@ -115,7 +115,7 @@
         <w:pStyle w:val="ListNumber"/>
       </w:pPr>
       <w:r>
-        <w:t>[6] https://doi.org/10.1038/nature14539</w:t>
+        <w:t>[6] https://doi.org/10.1001/jama.2016.9797</w:t>
       </w:r>
     </w:p>
     <w:p>
@@ -123,7 +123,7 @@
         <w:pStyle w:val="ListNumber"/>
       </w:pPr>
       <w:r>
-        <w:t>[7] https://doi.org/10.1001/jama.2016.9797</w:t>
+        <w:t>[7] https://doi.org/10.1056/NEJMoa2034577</w:t>
       </w:r>
     </w:p>
     <w:p>
@@ -131,7 +131,15 @@
         <w:pStyle w:val="ListNumber"/>
       </w:pPr>
       <w:r>
-        <w:t>[8] https://doi.org/10.1371/journal.pone.0173664</w:t>
+        <w:t>[8] https://doi.org/10.1056/NEJMoa2034577</w:t>
+      </w:r>
+    </w:p>
+    <w:p>
+      <w:pPr>
+        <w:pStyle w:val="ListNumber"/>
+      </w:pPr>
+      <w:r>
+        <w:t>[9] https://doi.org/10.1038/s41586-020-2649-2</w:t>
       </w:r>
     </w:p>
     <w:sectPr>

</xml_diff>

<commit_message>
#22 Complete the fixture corpus on main (near-dup, budget-math, remaining files) (#94)
main landed through #73 (wrong_paper + 60 files) but #77/#84/#91 closed without
merging. This carries the missing delta so #22 is complete:

- near-duplicate pairs (--near-dups; is_near_duplicate + duplicate_of)
- budget_math defect (itemized budget whose items don't sum)
- corpus 120 -> 126 records; files 60 -> 72 (adds budget_math + a rendered
  near-duplicate pair)
- score.py scores every defect

Regenerate: python3 scripts/synth/synth_proposals.py --n 120 --offline --seed 42
--near-dups 6 --out tests/fixtures/synthetic

Co-authored-by: 990991A (claude-code) <261970523+990991A@users.noreply.github.com>
Co-authored-by: Claude Opus 4.8 <noreply@anthropic.com>
</commit_message>
<xml_diff>
--- a/tests/fixtures/synthetic/files/blog_post__ai_clean.docx
+++ b/tests/fixtures/synthetic/files/blog_post__ai_clean.docx
@@ -7,7 +7,7 @@
         <w:pStyle w:val="Title"/>
       </w:pPr>
       <w:r>
-        <w:t>Why workforce pathways into the semiconductor manufacturing sector Matters Now</w:t>
+        <w:t>Why behavioral economics of retirement savings among gig workers Matters Now</w:t>
       </w:r>
     </w:p>
     <w:p>
@@ -20,7 +20,7 @@
     </w:p>
     <w:p>
       <w:r>
-        <w:t>What we know about workforce pathways into the semiconductor manufacturing sector, and what to watch.</w:t>
+        <w:t>What we know about behavioral economics of retirement savings among gig workers, and what to watch.</w:t>
       </w:r>
     </w:p>
     <w:p>
@@ -33,7 +33,7 @@
     </w:p>
     <w:p>
       <w:r>
-        <w:t>The evidence base is partial, and important gaps remain. The takeaways are meant to inform, not to prescribe. Careful framing guards against overstatement.</w:t>
+        <w:t>This piece examines behavioral economics of retirement savings among gig workers, a question of growing public interest. Careful framing guards against overstatement. Practitioners and policymakers alike have a role to play here.</w:t>
       </w:r>
     </w:p>
     <w:p>
@@ -46,7 +46,7 @@
     </w:p>
     <w:p>
       <w:r>
-        <w:t>The takeaways are meant to inform, not to prescribe. Practitioners and policymakers alike have a role to play here. This piece examines workforce pathways into the semiconductor manufacturing sector, a question of growing public interest.</w:t>
+        <w:t>The takeaways are meant to inform, not to prescribe. Recent analysis points toward a tractable path forward. The discussion draws on established population methods and current data.</w:t>
       </w:r>
     </w:p>
     <w:p>
@@ -59,7 +59,7 @@
     </w:p>
     <w:p>
       <w:r>
-        <w:t>Recent analysis points toward a tractable path forward.</w:t>
+        <w:t>This piece examines behavioral economics of retirement savings among gig workers, a question of growing public interest.</w:t>
       </w:r>
     </w:p>
     <w:p>
@@ -75,7 +75,7 @@
         <w:pStyle w:val="ListNumber"/>
       </w:pPr>
       <w:r>
-        <w:t>[1] https://doi.org/10.1371/journal.pone.0173664</w:t>
+        <w:t>[1] https://doi.org/10.1021/jacs.9b02765</w:t>
       </w:r>
     </w:p>
     <w:p>
@@ -83,7 +83,7 @@
         <w:pStyle w:val="ListNumber"/>
       </w:pPr>
       <w:r>
-        <w:t>[2] https://doi.org/10.1016/j.cell.2016.07.054</w:t>
+        <w:t>[2] https://doi.org/10.1002/anie.201907688</w:t>
       </w:r>
     </w:p>
     <w:p>
@@ -91,7 +91,7 @@
         <w:pStyle w:val="ListNumber"/>
       </w:pPr>
       <w:r>
-        <w:t>[3] https://doi.org/10.1126/science.1259855</w:t>
+        <w:t>[3] https://doi.org/10.1289/ehp.1104477</w:t>
       </w:r>
     </w:p>
     <w:p>
@@ -99,7 +99,7 @@
         <w:pStyle w:val="ListNumber"/>
       </w:pPr>
       <w:r>
-        <w:t>[4] https://doi.org/10.1101/gr.229102</w:t>
+        <w:t>[4] https://doi.org/10.1056/NEJMoa2034577</w:t>
       </w:r>
     </w:p>
     <w:p>
@@ -107,7 +107,7 @@
         <w:pStyle w:val="ListNumber"/>
       </w:pPr>
       <w:r>
-        <w:t>[5] https://doi.org/10.1056/NEJMoa2034577</w:t>
+        <w:t>[5] https://doi.org/10.1073/pnas.1517384113</w:t>
       </w:r>
     </w:p>
     <w:p>
@@ -115,7 +115,7 @@
         <w:pStyle w:val="ListNumber"/>
       </w:pPr>
       <w:r>
-        <w:t>[6] https://doi.org/10.1038/nature14539</w:t>
+        <w:t>[6] https://doi.org/10.1001/jama.2016.9797</w:t>
       </w:r>
     </w:p>
     <w:p>
@@ -123,7 +123,7 @@
         <w:pStyle w:val="ListNumber"/>
       </w:pPr>
       <w:r>
-        <w:t>[7] https://doi.org/10.1001/jama.2016.9797</w:t>
+        <w:t>[7] https://doi.org/10.1056/NEJMoa2034577</w:t>
       </w:r>
     </w:p>
     <w:p>
@@ -131,7 +131,15 @@
         <w:pStyle w:val="ListNumber"/>
       </w:pPr>
       <w:r>
-        <w:t>[8] https://doi.org/10.1371/journal.pone.0173664</w:t>
+        <w:t>[8] https://doi.org/10.1056/NEJMoa2034577</w:t>
+      </w:r>
+    </w:p>
+    <w:p>
+      <w:pPr>
+        <w:pStyle w:val="ListNumber"/>
+      </w:pPr>
+      <w:r>
+        <w:t>[9] https://doi.org/10.1038/s41586-020-2649-2</w:t>
       </w:r>
     </w:p>
     <w:sectPr>

</xml_diff>